<commit_message>
removed old figure 3, finished analysis
</commit_message>
<xml_diff>
--- a/Outputs/ST1.docx
+++ b/Outputs/ST1.docx
@@ -34,6 +34,7 @@
           </w:tcPr>
           <w:p>
             <w:pPr>
+              <w:pStyle w:val="Normal"/>
               <w:jc w:val="left"/>
               <w:pBdr>
                 <w:bottom w:val="none" w:sz="0" w:space="0" w:color="000000"/>
@@ -86,6 +87,7 @@
           </w:tcPr>
           <w:p>
             <w:pPr>
+              <w:pStyle w:val="Normal"/>
               <w:jc w:val="center"/>
               <w:pBdr>
                 <w:bottom w:val="none" w:sz="0" w:space="0" w:color="000000"/>
@@ -138,6 +140,7 @@
           </w:tcPr>
           <w:p>
             <w:pPr>
+              <w:pStyle w:val="Normal"/>
               <w:jc w:val="center"/>
               <w:pBdr>
                 <w:bottom w:val="none" w:sz="0" w:space="0" w:color="000000"/>
@@ -190,6 +193,7 @@
           </w:tcPr>
           <w:p>
             <w:pPr>
+              <w:pStyle w:val="Normal"/>
               <w:jc w:val="center"/>
               <w:pBdr>
                 <w:bottom w:val="none" w:sz="0" w:space="0" w:color="000000"/>
@@ -242,6 +246,7 @@
           </w:tcPr>
           <w:p>
             <w:pPr>
+              <w:pStyle w:val="Normal"/>
               <w:jc w:val="center"/>
               <w:pBdr>
                 <w:bottom w:val="none" w:sz="0" w:space="0" w:color="000000"/>
@@ -294,6 +299,7 @@
           </w:tcPr>
           <w:p>
             <w:pPr>
+              <w:pStyle w:val="Normal"/>
               <w:jc w:val="center"/>
               <w:pBdr>
                 <w:bottom w:val="none" w:sz="0" w:space="0" w:color="000000"/>
@@ -346,6 +352,7 @@
           </w:tcPr>
           <w:p>
             <w:pPr>
+              <w:pStyle w:val="Normal"/>
               <w:jc w:val="center"/>
               <w:pBdr>
                 <w:bottom w:val="none" w:sz="0" w:space="0" w:color="000000"/>
@@ -398,6 +405,7 @@
           </w:tcPr>
           <w:p>
             <w:pPr>
+              <w:pStyle w:val="Normal"/>
               <w:jc w:val="center"/>
               <w:pBdr>
                 <w:bottom w:val="none" w:sz="0" w:space="0" w:color="000000"/>
@@ -456,6 +464,7 @@
           </w:tcPr>
           <w:p>
             <w:pPr>
+              <w:pStyle w:val="Normal"/>
               <w:jc w:val="left"/>
               <w:pBdr>
                 <w:bottom w:val="none" w:sz="0" w:space="0" w:color="000000"/>
@@ -508,6 +517,7 @@
           </w:tcPr>
           <w:p>
             <w:pPr>
+              <w:pStyle w:val="Normal"/>
               <w:jc w:val="center"/>
               <w:pBdr>
                 <w:bottom w:val="none" w:sz="0" w:space="0" w:color="000000"/>
@@ -560,6 +570,7 @@
           </w:tcPr>
           <w:p>
             <w:pPr>
+              <w:pStyle w:val="Normal"/>
               <w:jc w:val="center"/>
               <w:pBdr>
                 <w:bottom w:val="none" w:sz="0" w:space="0" w:color="000000"/>
@@ -612,6 +623,7 @@
           </w:tcPr>
           <w:p>
             <w:pPr>
+              <w:pStyle w:val="Normal"/>
               <w:jc w:val="center"/>
               <w:pBdr>
                 <w:bottom w:val="none" w:sz="0" w:space="0" w:color="000000"/>
@@ -664,6 +676,7 @@
           </w:tcPr>
           <w:p>
             <w:pPr>
+              <w:pStyle w:val="Normal"/>
               <w:jc w:val="center"/>
               <w:pBdr>
                 <w:bottom w:val="none" w:sz="0" w:space="0" w:color="000000"/>
@@ -716,6 +729,7 @@
           </w:tcPr>
           <w:p>
             <w:pPr>
+              <w:pStyle w:val="Normal"/>
               <w:jc w:val="center"/>
               <w:pBdr>
                 <w:bottom w:val="none" w:sz="0" w:space="0" w:color="000000"/>
@@ -768,6 +782,7 @@
           </w:tcPr>
           <w:p>
             <w:pPr>
+              <w:pStyle w:val="Normal"/>
               <w:jc w:val="center"/>
               <w:pBdr>
                 <w:bottom w:val="none" w:sz="0" w:space="0" w:color="000000"/>
@@ -820,6 +835,7 @@
           </w:tcPr>
           <w:p>
             <w:pPr>
+              <w:pStyle w:val="Normal"/>
               <w:jc w:val="center"/>
               <w:pBdr>
                 <w:bottom w:val="none" w:sz="0" w:space="0" w:color="000000"/>
@@ -878,6 +894,7 @@
           </w:tcPr>
           <w:p>
             <w:pPr>
+              <w:pStyle w:val="Normal"/>
               <w:jc w:val="left"/>
               <w:pBdr>
                 <w:bottom w:val="none" w:sz="0" w:space="0" w:color="000000"/>
@@ -930,6 +947,7 @@
           </w:tcPr>
           <w:p>
             <w:pPr>
+              <w:pStyle w:val="Normal"/>
               <w:jc w:val="center"/>
               <w:pBdr>
                 <w:bottom w:val="none" w:sz="0" w:space="0" w:color="000000"/>
@@ -982,6 +1000,7 @@
           </w:tcPr>
           <w:p>
             <w:pPr>
+              <w:pStyle w:val="Normal"/>
               <w:jc w:val="center"/>
               <w:pBdr>
                 <w:bottom w:val="none" w:sz="0" w:space="0" w:color="000000"/>
@@ -1034,6 +1053,7 @@
           </w:tcPr>
           <w:p>
             <w:pPr>
+              <w:pStyle w:val="Normal"/>
               <w:jc w:val="center"/>
               <w:pBdr>
                 <w:bottom w:val="none" w:sz="0" w:space="0" w:color="000000"/>
@@ -1086,6 +1106,7 @@
           </w:tcPr>
           <w:p>
             <w:pPr>
+              <w:pStyle w:val="Normal"/>
               <w:jc w:val="center"/>
               <w:pBdr>
                 <w:bottom w:val="none" w:sz="0" w:space="0" w:color="000000"/>
@@ -1138,6 +1159,7 @@
           </w:tcPr>
           <w:p>
             <w:pPr>
+              <w:pStyle w:val="Normal"/>
               <w:jc w:val="center"/>
               <w:pBdr>
                 <w:bottom w:val="none" w:sz="0" w:space="0" w:color="000000"/>
@@ -1190,6 +1212,7 @@
           </w:tcPr>
           <w:p>
             <w:pPr>
+              <w:pStyle w:val="Normal"/>
               <w:jc w:val="center"/>
               <w:pBdr>
                 <w:bottom w:val="none" w:sz="0" w:space="0" w:color="000000"/>
@@ -1242,6 +1265,7 @@
           </w:tcPr>
           <w:p>
             <w:pPr>
+              <w:pStyle w:val="Normal"/>
               <w:jc w:val="center"/>
               <w:pBdr>
                 <w:bottom w:val="none" w:sz="0" w:space="0" w:color="000000"/>
@@ -1300,6 +1324,7 @@
           </w:tcPr>
           <w:p>
             <w:pPr>
+              <w:pStyle w:val="Normal"/>
               <w:jc w:val="left"/>
               <w:pBdr>
                 <w:bottom w:val="none" w:sz="0" w:space="0" w:color="000000"/>
@@ -1352,6 +1377,7 @@
           </w:tcPr>
           <w:p>
             <w:pPr>
+              <w:pStyle w:val="Normal"/>
               <w:jc w:val="center"/>
               <w:pBdr>
                 <w:bottom w:val="none" w:sz="0" w:space="0" w:color="000000"/>
@@ -1404,6 +1430,7 @@
           </w:tcPr>
           <w:p>
             <w:pPr>
+              <w:pStyle w:val="Normal"/>
               <w:jc w:val="center"/>
               <w:pBdr>
                 <w:bottom w:val="none" w:sz="0" w:space="0" w:color="000000"/>
@@ -1456,6 +1483,7 @@
           </w:tcPr>
           <w:p>
             <w:pPr>
+              <w:pStyle w:val="Normal"/>
               <w:jc w:val="center"/>
               <w:pBdr>
                 <w:bottom w:val="none" w:sz="0" w:space="0" w:color="000000"/>
@@ -1508,6 +1536,7 @@
           </w:tcPr>
           <w:p>
             <w:pPr>
+              <w:pStyle w:val="Normal"/>
               <w:jc w:val="center"/>
               <w:pBdr>
                 <w:bottom w:val="none" w:sz="0" w:space="0" w:color="000000"/>
@@ -1560,6 +1589,7 @@
           </w:tcPr>
           <w:p>
             <w:pPr>
+              <w:pStyle w:val="Normal"/>
               <w:jc w:val="center"/>
               <w:pBdr>
                 <w:bottom w:val="none" w:sz="0" w:space="0" w:color="000000"/>
@@ -1612,6 +1642,7 @@
           </w:tcPr>
           <w:p>
             <w:pPr>
+              <w:pStyle w:val="Normal"/>
               <w:jc w:val="center"/>
               <w:pBdr>
                 <w:bottom w:val="none" w:sz="0" w:space="0" w:color="000000"/>
@@ -1664,6 +1695,7 @@
           </w:tcPr>
           <w:p>
             <w:pPr>
+              <w:pStyle w:val="Normal"/>
               <w:jc w:val="center"/>
               <w:pBdr>
                 <w:bottom w:val="none" w:sz="0" w:space="0" w:color="000000"/>
@@ -1722,6 +1754,7 @@
           </w:tcPr>
           <w:p>
             <w:pPr>
+              <w:pStyle w:val="Normal"/>
               <w:jc w:val="left"/>
               <w:pBdr>
                 <w:bottom w:val="none" w:sz="0" w:space="0" w:color="000000"/>
@@ -1774,6 +1807,7 @@
           </w:tcPr>
           <w:p>
             <w:pPr>
+              <w:pStyle w:val="Normal"/>
               <w:jc w:val="center"/>
               <w:pBdr>
                 <w:bottom w:val="none" w:sz="0" w:space="0" w:color="000000"/>
@@ -1826,6 +1860,7 @@
           </w:tcPr>
           <w:p>
             <w:pPr>
+              <w:pStyle w:val="Normal"/>
               <w:jc w:val="center"/>
               <w:pBdr>
                 <w:bottom w:val="none" w:sz="0" w:space="0" w:color="000000"/>
@@ -1878,6 +1913,7 @@
           </w:tcPr>
           <w:p>
             <w:pPr>
+              <w:pStyle w:val="Normal"/>
               <w:jc w:val="center"/>
               <w:pBdr>
                 <w:bottom w:val="none" w:sz="0" w:space="0" w:color="000000"/>
@@ -1930,6 +1966,7 @@
           </w:tcPr>
           <w:p>
             <w:pPr>
+              <w:pStyle w:val="Normal"/>
               <w:jc w:val="center"/>
               <w:pBdr>
                 <w:bottom w:val="none" w:sz="0" w:space="0" w:color="000000"/>
@@ -1982,6 +2019,7 @@
           </w:tcPr>
           <w:p>
             <w:pPr>
+              <w:pStyle w:val="Normal"/>
               <w:jc w:val="center"/>
               <w:pBdr>
                 <w:bottom w:val="none" w:sz="0" w:space="0" w:color="000000"/>
@@ -2034,6 +2072,7 @@
           </w:tcPr>
           <w:p>
             <w:pPr>
+              <w:pStyle w:val="Normal"/>
               <w:jc w:val="center"/>
               <w:pBdr>
                 <w:bottom w:val="none" w:sz="0" w:space="0" w:color="000000"/>
@@ -2086,6 +2125,7 @@
           </w:tcPr>
           <w:p>
             <w:pPr>
+              <w:pStyle w:val="Normal"/>
               <w:jc w:val="center"/>
               <w:pBdr>
                 <w:bottom w:val="none" w:sz="0" w:space="0" w:color="000000"/>
@@ -2144,6 +2184,7 @@
           </w:tcPr>
           <w:p>
             <w:pPr>
+              <w:pStyle w:val="Normal"/>
               <w:jc w:val="left"/>
               <w:pBdr>
                 <w:bottom w:val="none" w:sz="0" w:space="0" w:color="000000"/>
@@ -2196,6 +2237,7 @@
           </w:tcPr>
           <w:p>
             <w:pPr>
+              <w:pStyle w:val="Normal"/>
               <w:jc w:val="center"/>
               <w:pBdr>
                 <w:bottom w:val="none" w:sz="0" w:space="0" w:color="000000"/>
@@ -2248,6 +2290,7 @@
           </w:tcPr>
           <w:p>
             <w:pPr>
+              <w:pStyle w:val="Normal"/>
               <w:jc w:val="center"/>
               <w:pBdr>
                 <w:bottom w:val="none" w:sz="0" w:space="0" w:color="000000"/>
@@ -2300,6 +2343,7 @@
           </w:tcPr>
           <w:p>
             <w:pPr>
+              <w:pStyle w:val="Normal"/>
               <w:jc w:val="center"/>
               <w:pBdr>
                 <w:bottom w:val="none" w:sz="0" w:space="0" w:color="000000"/>
@@ -2352,6 +2396,7 @@
           </w:tcPr>
           <w:p>
             <w:pPr>
+              <w:pStyle w:val="Normal"/>
               <w:jc w:val="center"/>
               <w:pBdr>
                 <w:bottom w:val="none" w:sz="0" w:space="0" w:color="000000"/>
@@ -2404,6 +2449,7 @@
           </w:tcPr>
           <w:p>
             <w:pPr>
+              <w:pStyle w:val="Normal"/>
               <w:jc w:val="center"/>
               <w:pBdr>
                 <w:bottom w:val="none" w:sz="0" w:space="0" w:color="000000"/>
@@ -2456,6 +2502,7 @@
           </w:tcPr>
           <w:p>
             <w:pPr>
+              <w:pStyle w:val="Normal"/>
               <w:jc w:val="center"/>
               <w:pBdr>
                 <w:bottom w:val="none" w:sz="0" w:space="0" w:color="000000"/>
@@ -2508,6 +2555,7 @@
           </w:tcPr>
           <w:p>
             <w:pPr>
+              <w:pStyle w:val="Normal"/>
               <w:jc w:val="center"/>
               <w:pBdr>
                 <w:bottom w:val="none" w:sz="0" w:space="0" w:color="000000"/>
@@ -2566,6 +2614,7 @@
           </w:tcPr>
           <w:p>
             <w:pPr>
+              <w:pStyle w:val="Normal"/>
               <w:jc w:val="left"/>
               <w:pBdr>
                 <w:bottom w:val="none" w:sz="0" w:space="0" w:color="000000"/>
@@ -2618,6 +2667,7 @@
           </w:tcPr>
           <w:p>
             <w:pPr>
+              <w:pStyle w:val="Normal"/>
               <w:jc w:val="center"/>
               <w:pBdr>
                 <w:bottom w:val="none" w:sz="0" w:space="0" w:color="000000"/>
@@ -2670,6 +2720,7 @@
           </w:tcPr>
           <w:p>
             <w:pPr>
+              <w:pStyle w:val="Normal"/>
               <w:jc w:val="center"/>
               <w:pBdr>
                 <w:bottom w:val="none" w:sz="0" w:space="0" w:color="000000"/>
@@ -2722,6 +2773,7 @@
           </w:tcPr>
           <w:p>
             <w:pPr>
+              <w:pStyle w:val="Normal"/>
               <w:jc w:val="center"/>
               <w:pBdr>
                 <w:bottom w:val="none" w:sz="0" w:space="0" w:color="000000"/>
@@ -2774,6 +2826,7 @@
           </w:tcPr>
           <w:p>
             <w:pPr>
+              <w:pStyle w:val="Normal"/>
               <w:jc w:val="center"/>
               <w:pBdr>
                 <w:bottom w:val="none" w:sz="0" w:space="0" w:color="000000"/>
@@ -2826,6 +2879,7 @@
           </w:tcPr>
           <w:p>
             <w:pPr>
+              <w:pStyle w:val="Normal"/>
               <w:jc w:val="center"/>
               <w:pBdr>
                 <w:bottom w:val="none" w:sz="0" w:space="0" w:color="000000"/>
@@ -2878,6 +2932,7 @@
           </w:tcPr>
           <w:p>
             <w:pPr>
+              <w:pStyle w:val="Normal"/>
               <w:jc w:val="center"/>
               <w:pBdr>
                 <w:bottom w:val="none" w:sz="0" w:space="0" w:color="000000"/>
@@ -2930,6 +2985,7 @@
           </w:tcPr>
           <w:p>
             <w:pPr>
+              <w:pStyle w:val="Normal"/>
               <w:jc w:val="center"/>
               <w:pBdr>
                 <w:bottom w:val="none" w:sz="0" w:space="0" w:color="000000"/>
@@ -2988,6 +3044,7 @@
           </w:tcPr>
           <w:p>
             <w:pPr>
+              <w:pStyle w:val="Normal"/>
               <w:jc w:val="left"/>
               <w:pBdr>
                 <w:bottom w:val="none" w:sz="0" w:space="0" w:color="000000"/>
@@ -3040,6 +3097,7 @@
           </w:tcPr>
           <w:p>
             <w:pPr>
+              <w:pStyle w:val="Normal"/>
               <w:jc w:val="center"/>
               <w:pBdr>
                 <w:bottom w:val="none" w:sz="0" w:space="0" w:color="000000"/>
@@ -3092,6 +3150,7 @@
           </w:tcPr>
           <w:p>
             <w:pPr>
+              <w:pStyle w:val="Normal"/>
               <w:jc w:val="center"/>
               <w:pBdr>
                 <w:bottom w:val="none" w:sz="0" w:space="0" w:color="000000"/>
@@ -3144,6 +3203,7 @@
           </w:tcPr>
           <w:p>
             <w:pPr>
+              <w:pStyle w:val="Normal"/>
               <w:jc w:val="center"/>
               <w:pBdr>
                 <w:bottom w:val="none" w:sz="0" w:space="0" w:color="000000"/>
@@ -3196,6 +3256,7 @@
           </w:tcPr>
           <w:p>
             <w:pPr>
+              <w:pStyle w:val="Normal"/>
               <w:jc w:val="center"/>
               <w:pBdr>
                 <w:bottom w:val="none" w:sz="0" w:space="0" w:color="000000"/>
@@ -3248,6 +3309,7 @@
           </w:tcPr>
           <w:p>
             <w:pPr>
+              <w:pStyle w:val="Normal"/>
               <w:jc w:val="center"/>
               <w:pBdr>
                 <w:bottom w:val="none" w:sz="0" w:space="0" w:color="000000"/>
@@ -3300,6 +3362,7 @@
           </w:tcPr>
           <w:p>
             <w:pPr>
+              <w:pStyle w:val="Normal"/>
               <w:jc w:val="center"/>
               <w:pBdr>
                 <w:bottom w:val="none" w:sz="0" w:space="0" w:color="000000"/>
@@ -3352,6 +3415,7 @@
           </w:tcPr>
           <w:p>
             <w:pPr>
+              <w:pStyle w:val="Normal"/>
               <w:jc w:val="center"/>
               <w:pBdr>
                 <w:bottom w:val="none" w:sz="0" w:space="0" w:color="000000"/>
@@ -3410,6 +3474,7 @@
           </w:tcPr>
           <w:p>
             <w:pPr>
+              <w:pStyle w:val="Normal"/>
               <w:jc w:val="left"/>
               <w:pBdr>
                 <w:bottom w:val="none" w:sz="0" w:space="0" w:color="000000"/>
@@ -3462,6 +3527,7 @@
           </w:tcPr>
           <w:p>
             <w:pPr>
+              <w:pStyle w:val="Normal"/>
               <w:jc w:val="center"/>
               <w:pBdr>
                 <w:bottom w:val="none" w:sz="0" w:space="0" w:color="000000"/>
@@ -3514,6 +3580,7 @@
           </w:tcPr>
           <w:p>
             <w:pPr>
+              <w:pStyle w:val="Normal"/>
               <w:jc w:val="center"/>
               <w:pBdr>
                 <w:bottom w:val="none" w:sz="0" w:space="0" w:color="000000"/>
@@ -3566,6 +3633,7 @@
           </w:tcPr>
           <w:p>
             <w:pPr>
+              <w:pStyle w:val="Normal"/>
               <w:jc w:val="center"/>
               <w:pBdr>
                 <w:bottom w:val="none" w:sz="0" w:space="0" w:color="000000"/>
@@ -3618,6 +3686,7 @@
           </w:tcPr>
           <w:p>
             <w:pPr>
+              <w:pStyle w:val="Normal"/>
               <w:jc w:val="center"/>
               <w:pBdr>
                 <w:bottom w:val="none" w:sz="0" w:space="0" w:color="000000"/>
@@ -3670,6 +3739,7 @@
           </w:tcPr>
           <w:p>
             <w:pPr>
+              <w:pStyle w:val="Normal"/>
               <w:jc w:val="center"/>
               <w:pBdr>
                 <w:bottom w:val="none" w:sz="0" w:space="0" w:color="000000"/>
@@ -3722,6 +3792,7 @@
           </w:tcPr>
           <w:p>
             <w:pPr>
+              <w:pStyle w:val="Normal"/>
               <w:jc w:val="center"/>
               <w:pBdr>
                 <w:bottom w:val="none" w:sz="0" w:space="0" w:color="000000"/>
@@ -3774,6 +3845,7 @@
           </w:tcPr>
           <w:p>
             <w:pPr>
+              <w:pStyle w:val="Normal"/>
               <w:jc w:val="center"/>
               <w:pBdr>
                 <w:bottom w:val="none" w:sz="0" w:space="0" w:color="000000"/>
@@ -3832,6 +3904,7 @@
           </w:tcPr>
           <w:p>
             <w:pPr>
+              <w:pStyle w:val="Normal"/>
               <w:jc w:val="left"/>
               <w:pBdr>
                 <w:bottom w:val="none" w:sz="0" w:space="0" w:color="000000"/>
@@ -3884,6 +3957,7 @@
           </w:tcPr>
           <w:p>
             <w:pPr>
+              <w:pStyle w:val="Normal"/>
               <w:jc w:val="center"/>
               <w:pBdr>
                 <w:bottom w:val="none" w:sz="0" w:space="0" w:color="000000"/>
@@ -3936,6 +4010,7 @@
           </w:tcPr>
           <w:p>
             <w:pPr>
+              <w:pStyle w:val="Normal"/>
               <w:jc w:val="center"/>
               <w:pBdr>
                 <w:bottom w:val="none" w:sz="0" w:space="0" w:color="000000"/>
@@ -3988,6 +4063,7 @@
           </w:tcPr>
           <w:p>
             <w:pPr>
+              <w:pStyle w:val="Normal"/>
               <w:jc w:val="center"/>
               <w:pBdr>
                 <w:bottom w:val="none" w:sz="0" w:space="0" w:color="000000"/>
@@ -4040,6 +4116,7 @@
           </w:tcPr>
           <w:p>
             <w:pPr>
+              <w:pStyle w:val="Normal"/>
               <w:jc w:val="center"/>
               <w:pBdr>
                 <w:bottom w:val="none" w:sz="0" w:space="0" w:color="000000"/>
@@ -4092,6 +4169,7 @@
           </w:tcPr>
           <w:p>
             <w:pPr>
+              <w:pStyle w:val="Normal"/>
               <w:jc w:val="center"/>
               <w:pBdr>
                 <w:bottom w:val="none" w:sz="0" w:space="0" w:color="000000"/>
@@ -4144,6 +4222,7 @@
           </w:tcPr>
           <w:p>
             <w:pPr>
+              <w:pStyle w:val="Normal"/>
               <w:jc w:val="center"/>
               <w:pBdr>
                 <w:bottom w:val="none" w:sz="0" w:space="0" w:color="000000"/>
@@ -4196,6 +4275,7 @@
           </w:tcPr>
           <w:p>
             <w:pPr>
+              <w:pStyle w:val="Normal"/>
               <w:jc w:val="center"/>
               <w:pBdr>
                 <w:bottom w:val="none" w:sz="0" w:space="0" w:color="000000"/>
@@ -4254,6 +4334,7 @@
           </w:tcPr>
           <w:p>
             <w:pPr>
+              <w:pStyle w:val="Normal"/>
               <w:jc w:val="left"/>
               <w:pBdr>
                 <w:bottom w:val="none" w:sz="0" w:space="0" w:color="000000"/>
@@ -4306,6 +4387,7 @@
           </w:tcPr>
           <w:p>
             <w:pPr>
+              <w:pStyle w:val="Normal"/>
               <w:jc w:val="center"/>
               <w:pBdr>
                 <w:bottom w:val="none" w:sz="0" w:space="0" w:color="000000"/>
@@ -4358,6 +4440,7 @@
           </w:tcPr>
           <w:p>
             <w:pPr>
+              <w:pStyle w:val="Normal"/>
               <w:jc w:val="center"/>
               <w:pBdr>
                 <w:bottom w:val="none" w:sz="0" w:space="0" w:color="000000"/>
@@ -4410,6 +4493,7 @@
           </w:tcPr>
           <w:p>
             <w:pPr>
+              <w:pStyle w:val="Normal"/>
               <w:jc w:val="center"/>
               <w:pBdr>
                 <w:bottom w:val="none" w:sz="0" w:space="0" w:color="000000"/>
@@ -4462,6 +4546,7 @@
           </w:tcPr>
           <w:p>
             <w:pPr>
+              <w:pStyle w:val="Normal"/>
               <w:jc w:val="center"/>
               <w:pBdr>
                 <w:bottom w:val="none" w:sz="0" w:space="0" w:color="000000"/>
@@ -4514,6 +4599,7 @@
           </w:tcPr>
           <w:p>
             <w:pPr>
+              <w:pStyle w:val="Normal"/>
               <w:jc w:val="center"/>
               <w:pBdr>
                 <w:bottom w:val="none" w:sz="0" w:space="0" w:color="000000"/>
@@ -4566,6 +4652,7 @@
           </w:tcPr>
           <w:p>
             <w:pPr>
+              <w:pStyle w:val="Normal"/>
               <w:jc w:val="center"/>
               <w:pBdr>
                 <w:bottom w:val="none" w:sz="0" w:space="0" w:color="000000"/>
@@ -4618,6 +4705,7 @@
           </w:tcPr>
           <w:p>
             <w:pPr>
+              <w:pStyle w:val="Normal"/>
               <w:jc w:val="center"/>
               <w:pBdr>
                 <w:bottom w:val="none" w:sz="0" w:space="0" w:color="000000"/>
@@ -4676,6 +4764,7 @@
           </w:tcPr>
           <w:p>
             <w:pPr>
+              <w:pStyle w:val="Normal"/>
               <w:jc w:val="left"/>
               <w:pBdr>
                 <w:bottom w:val="none" w:sz="0" w:space="0" w:color="000000"/>
@@ -4728,6 +4817,7 @@
           </w:tcPr>
           <w:p>
             <w:pPr>
+              <w:pStyle w:val="Normal"/>
               <w:jc w:val="center"/>
               <w:pBdr>
                 <w:bottom w:val="none" w:sz="0" w:space="0" w:color="000000"/>
@@ -4780,6 +4870,7 @@
           </w:tcPr>
           <w:p>
             <w:pPr>
+              <w:pStyle w:val="Normal"/>
               <w:jc w:val="center"/>
               <w:pBdr>
                 <w:bottom w:val="none" w:sz="0" w:space="0" w:color="000000"/>
@@ -4832,6 +4923,7 @@
           </w:tcPr>
           <w:p>
             <w:pPr>
+              <w:pStyle w:val="Normal"/>
               <w:jc w:val="center"/>
               <w:pBdr>
                 <w:bottom w:val="none" w:sz="0" w:space="0" w:color="000000"/>
@@ -4884,6 +4976,7 @@
           </w:tcPr>
           <w:p>
             <w:pPr>
+              <w:pStyle w:val="Normal"/>
               <w:jc w:val="center"/>
               <w:pBdr>
                 <w:bottom w:val="none" w:sz="0" w:space="0" w:color="000000"/>
@@ -4936,6 +5029,7 @@
           </w:tcPr>
           <w:p>
             <w:pPr>
+              <w:pStyle w:val="Normal"/>
               <w:jc w:val="center"/>
               <w:pBdr>
                 <w:bottom w:val="none" w:sz="0" w:space="0" w:color="000000"/>
@@ -4988,6 +5082,7 @@
           </w:tcPr>
           <w:p>
             <w:pPr>
+              <w:pStyle w:val="Normal"/>
               <w:jc w:val="center"/>
               <w:pBdr>
                 <w:bottom w:val="none" w:sz="0" w:space="0" w:color="000000"/>
@@ -5040,6 +5135,7 @@
           </w:tcPr>
           <w:p>
             <w:pPr>
+              <w:pStyle w:val="Normal"/>
               <w:jc w:val="center"/>
               <w:pBdr>
                 <w:bottom w:val="none" w:sz="0" w:space="0" w:color="000000"/>
@@ -5098,6 +5194,7 @@
           </w:tcPr>
           <w:p>
             <w:pPr>
+              <w:pStyle w:val="Normal"/>
               <w:jc w:val="left"/>
               <w:pBdr>
                 <w:bottom w:val="none" w:sz="0" w:space="0" w:color="000000"/>
@@ -5150,6 +5247,7 @@
           </w:tcPr>
           <w:p>
             <w:pPr>
+              <w:pStyle w:val="Normal"/>
               <w:jc w:val="center"/>
               <w:pBdr>
                 <w:bottom w:val="none" w:sz="0" w:space="0" w:color="000000"/>
@@ -5202,6 +5300,7 @@
           </w:tcPr>
           <w:p>
             <w:pPr>
+              <w:pStyle w:val="Normal"/>
               <w:jc w:val="center"/>
               <w:pBdr>
                 <w:bottom w:val="none" w:sz="0" w:space="0" w:color="000000"/>
@@ -5254,6 +5353,7 @@
           </w:tcPr>
           <w:p>
             <w:pPr>
+              <w:pStyle w:val="Normal"/>
               <w:jc w:val="center"/>
               <w:pBdr>
                 <w:bottom w:val="none" w:sz="0" w:space="0" w:color="000000"/>
@@ -5306,6 +5406,7 @@
           </w:tcPr>
           <w:p>
             <w:pPr>
+              <w:pStyle w:val="Normal"/>
               <w:jc w:val="center"/>
               <w:pBdr>
                 <w:bottom w:val="none" w:sz="0" w:space="0" w:color="000000"/>
@@ -5358,6 +5459,7 @@
           </w:tcPr>
           <w:p>
             <w:pPr>
+              <w:pStyle w:val="Normal"/>
               <w:jc w:val="center"/>
               <w:pBdr>
                 <w:bottom w:val="none" w:sz="0" w:space="0" w:color="000000"/>
@@ -5410,6 +5512,7 @@
           </w:tcPr>
           <w:p>
             <w:pPr>
+              <w:pStyle w:val="Normal"/>
               <w:jc w:val="center"/>
               <w:pBdr>
                 <w:bottom w:val="none" w:sz="0" w:space="0" w:color="000000"/>
@@ -5462,6 +5565,7 @@
           </w:tcPr>
           <w:p>
             <w:pPr>
+              <w:pStyle w:val="Normal"/>
               <w:jc w:val="center"/>
               <w:pBdr>
                 <w:bottom w:val="none" w:sz="0" w:space="0" w:color="000000"/>
@@ -5520,6 +5624,7 @@
           </w:tcPr>
           <w:p>
             <w:pPr>
+              <w:pStyle w:val="Normal"/>
               <w:jc w:val="left"/>
               <w:pBdr>
                 <w:bottom w:val="none" w:sz="0" w:space="0" w:color="000000"/>
@@ -5572,58 +5677,60 @@
           </w:tcPr>
           <w:p>
             <w:pPr>
-              <w:jc w:val="center"/>
-              <w:pBdr>
-                <w:bottom w:val="none" w:sz="0" w:space="0" w:color="000000"/>
-                <w:top w:val="none" w:sz="0" w:space="0" w:color="000000"/>
-                <w:left w:val="none" w:sz="0" w:space="0" w:color="000000"/>
-                <w:right w:val="none" w:sz="0" w:space="0" w:color="000000"/>
-              </w:pBdr>
-              <w:spacing w:after="100" w:before="100" w:line="240"/>
-              <w:ind w:left="100" w:right="100" w:firstLine="0" w:firstLineChars="0"/>
-              <w:rPr>
-                <w:rFonts w:ascii="Helvetica" w:hAnsi="Helvetica" w:eastAsia="Helvetica" w:cs="Helvetica"/>
-                <w:i w:val="false"/>
-                <w:b w:val="false"/>
-                <w:u w:val="none"/>
-                <w:sz w:val="20"/>
-                <w:szCs w:val="20"/>
-                <w:color w:val="000000"/>
-              </w:rPr>
-            </w:pPr>
-            <w:r>
-              <w:rPr>
-                <w:rFonts w:ascii="Helvetica" w:hAnsi="Helvetica" w:eastAsia="Helvetica" w:cs="Helvetica"/>
-                <w:i w:val="false"/>
-                <w:b w:val="false"/>
-                <w:u w:val="none"/>
-                <w:sz w:val="20"/>
-                <w:szCs w:val="20"/>
-                <w:color w:val="000000"/>
-              </w:rPr>
-              <w:t xml:space="preserve">20 [12.8–33]</w:t>
-            </w:r>
-          </w:p>
-        </w:tc>
-        <w:tc>
-          <w:tcPr>
-            <w:tcBorders>
-              <w:bottom w:val="none" w:sz="0" w:space="0" w:color="000000"/>
-              <w:top w:val="none" w:sz="0" w:space="0" w:color="000000"/>
-              <w:left w:val="none" w:sz="0" w:space="0" w:color="000000"/>
-              <w:right w:val="none" w:sz="0" w:space="0" w:color="000000"/>
-            </w:tcBorders>
-            <w:shd w:val="clear" w:color="auto" w:fill="FFFFFF"/>
-            <w:tcMar>
-              <w:top w:w="0" w:type="dxa"/>
-              <w:bottom w:w="0" w:type="dxa"/>
-              <w:left w:w="0" w:type="dxa"/>
-              <w:right w:w="0" w:type="dxa"/>
-            </w:tcMar>
-            <w:vAlign w:val="center"/>
-          </w:tcPr>
-          <w:p>
-            <w:pPr>
+              <w:pStyle w:val="Normal"/>
+              <w:jc w:val="center"/>
+              <w:pBdr>
+                <w:bottom w:val="none" w:sz="0" w:space="0" w:color="000000"/>
+                <w:top w:val="none" w:sz="0" w:space="0" w:color="000000"/>
+                <w:left w:val="none" w:sz="0" w:space="0" w:color="000000"/>
+                <w:right w:val="none" w:sz="0" w:space="0" w:color="000000"/>
+              </w:pBdr>
+              <w:spacing w:after="100" w:before="100" w:line="240"/>
+              <w:ind w:left="100" w:right="100" w:firstLine="0" w:firstLineChars="0"/>
+              <w:rPr>
+                <w:rFonts w:ascii="Helvetica" w:hAnsi="Helvetica" w:eastAsia="Helvetica" w:cs="Helvetica"/>
+                <w:i w:val="false"/>
+                <w:b w:val="false"/>
+                <w:u w:val="none"/>
+                <w:sz w:val="20"/>
+                <w:szCs w:val="20"/>
+                <w:color w:val="000000"/>
+              </w:rPr>
+            </w:pPr>
+            <w:r>
+              <w:rPr>
+                <w:rFonts w:ascii="Helvetica" w:hAnsi="Helvetica" w:eastAsia="Helvetica" w:cs="Helvetica"/>
+                <w:i w:val="false"/>
+                <w:b w:val="false"/>
+                <w:u w:val="none"/>
+                <w:sz w:val="20"/>
+                <w:szCs w:val="20"/>
+                <w:color w:val="000000"/>
+              </w:rPr>
+              <w:t xml:space="preserve">19.5 [10.8–30.5]</w:t>
+            </w:r>
+          </w:p>
+        </w:tc>
+        <w:tc>
+          <w:tcPr>
+            <w:tcBorders>
+              <w:bottom w:val="none" w:sz="0" w:space="0" w:color="000000"/>
+              <w:top w:val="none" w:sz="0" w:space="0" w:color="000000"/>
+              <w:left w:val="none" w:sz="0" w:space="0" w:color="000000"/>
+              <w:right w:val="none" w:sz="0" w:space="0" w:color="000000"/>
+            </w:tcBorders>
+            <w:shd w:val="clear" w:color="auto" w:fill="FFFFFF"/>
+            <w:tcMar>
+              <w:top w:w="0" w:type="dxa"/>
+              <w:bottom w:w="0" w:type="dxa"/>
+              <w:left w:w="0" w:type="dxa"/>
+              <w:right w:w="0" w:type="dxa"/>
+            </w:tcMar>
+            <w:vAlign w:val="center"/>
+          </w:tcPr>
+          <w:p>
+            <w:pPr>
+              <w:pStyle w:val="Normal"/>
               <w:jc w:val="center"/>
               <w:pBdr>
                 <w:bottom w:val="none" w:sz="0" w:space="0" w:color="000000"/>
@@ -5676,58 +5783,60 @@
           </w:tcPr>
           <w:p>
             <w:pPr>
-              <w:jc w:val="center"/>
-              <w:pBdr>
-                <w:bottom w:val="none" w:sz="0" w:space="0" w:color="000000"/>
-                <w:top w:val="none" w:sz="0" w:space="0" w:color="000000"/>
-                <w:left w:val="none" w:sz="0" w:space="0" w:color="000000"/>
-                <w:right w:val="none" w:sz="0" w:space="0" w:color="000000"/>
-              </w:pBdr>
-              <w:spacing w:after="100" w:before="100" w:line="240"/>
-              <w:ind w:left="100" w:right="100" w:firstLine="0" w:firstLineChars="0"/>
-              <w:rPr>
-                <w:rFonts w:ascii="Helvetica" w:hAnsi="Helvetica" w:eastAsia="Helvetica" w:cs="Helvetica"/>
-                <w:i w:val="false"/>
-                <w:b w:val="false"/>
-                <w:u w:val="none"/>
-                <w:sz w:val="20"/>
-                <w:szCs w:val="20"/>
-                <w:color w:val="000000"/>
-              </w:rPr>
-            </w:pPr>
-            <w:r>
-              <w:rPr>
-                <w:rFonts w:ascii="Helvetica" w:hAnsi="Helvetica" w:eastAsia="Helvetica" w:cs="Helvetica"/>
-                <w:i w:val="false"/>
-                <w:b w:val="false"/>
-                <w:u w:val="none"/>
-                <w:sz w:val="20"/>
-                <w:szCs w:val="20"/>
-                <w:color w:val="000000"/>
-              </w:rPr>
-              <w:t xml:space="preserve">0.14</w:t>
-            </w:r>
-          </w:p>
-        </w:tc>
-        <w:tc>
-          <w:tcPr>
-            <w:tcBorders>
-              <w:bottom w:val="none" w:sz="0" w:space="0" w:color="000000"/>
-              <w:top w:val="none" w:sz="0" w:space="0" w:color="000000"/>
-              <w:left w:val="none" w:sz="0" w:space="0" w:color="000000"/>
-              <w:right w:val="none" w:sz="0" w:space="0" w:color="000000"/>
-            </w:tcBorders>
-            <w:shd w:val="clear" w:color="auto" w:fill="FFFFFF"/>
-            <w:tcMar>
-              <w:top w:w="0" w:type="dxa"/>
-              <w:bottom w:w="0" w:type="dxa"/>
-              <w:left w:w="0" w:type="dxa"/>
-              <w:right w:w="0" w:type="dxa"/>
-            </w:tcMar>
-            <w:vAlign w:val="center"/>
-          </w:tcPr>
-          <w:p>
-            <w:pPr>
+              <w:pStyle w:val="Normal"/>
+              <w:jc w:val="center"/>
+              <w:pBdr>
+                <w:bottom w:val="none" w:sz="0" w:space="0" w:color="000000"/>
+                <w:top w:val="none" w:sz="0" w:space="0" w:color="000000"/>
+                <w:left w:val="none" w:sz="0" w:space="0" w:color="000000"/>
+                <w:right w:val="none" w:sz="0" w:space="0" w:color="000000"/>
+              </w:pBdr>
+              <w:spacing w:after="100" w:before="100" w:line="240"/>
+              <w:ind w:left="100" w:right="100" w:firstLine="0" w:firstLineChars="0"/>
+              <w:rPr>
+                <w:rFonts w:ascii="Helvetica" w:hAnsi="Helvetica" w:eastAsia="Helvetica" w:cs="Helvetica"/>
+                <w:i w:val="false"/>
+                <w:b w:val="false"/>
+                <w:u w:val="none"/>
+                <w:sz w:val="20"/>
+                <w:szCs w:val="20"/>
+                <w:color w:val="000000"/>
+              </w:rPr>
+            </w:pPr>
+            <w:r>
+              <w:rPr>
+                <w:rFonts w:ascii="Helvetica" w:hAnsi="Helvetica" w:eastAsia="Helvetica" w:cs="Helvetica"/>
+                <w:i w:val="false"/>
+                <w:b w:val="false"/>
+                <w:u w:val="none"/>
+                <w:sz w:val="20"/>
+                <w:szCs w:val="20"/>
+                <w:color w:val="000000"/>
+              </w:rPr>
+              <w:t xml:space="preserve">0.087</w:t>
+            </w:r>
+          </w:p>
+        </w:tc>
+        <w:tc>
+          <w:tcPr>
+            <w:tcBorders>
+              <w:bottom w:val="none" w:sz="0" w:space="0" w:color="000000"/>
+              <w:top w:val="none" w:sz="0" w:space="0" w:color="000000"/>
+              <w:left w:val="none" w:sz="0" w:space="0" w:color="000000"/>
+              <w:right w:val="none" w:sz="0" w:space="0" w:color="000000"/>
+            </w:tcBorders>
+            <w:shd w:val="clear" w:color="auto" w:fill="FFFFFF"/>
+            <w:tcMar>
+              <w:top w:w="0" w:type="dxa"/>
+              <w:bottom w:w="0" w:type="dxa"/>
+              <w:left w:w="0" w:type="dxa"/>
+              <w:right w:w="0" w:type="dxa"/>
+            </w:tcMar>
+            <w:vAlign w:val="center"/>
+          </w:tcPr>
+          <w:p>
+            <w:pPr>
+              <w:pStyle w:val="Normal"/>
               <w:jc w:val="center"/>
               <w:pBdr>
                 <w:bottom w:val="none" w:sz="0" w:space="0" w:color="000000"/>
@@ -5780,6 +5889,7 @@
           </w:tcPr>
           <w:p>
             <w:pPr>
+              <w:pStyle w:val="Normal"/>
               <w:jc w:val="center"/>
               <w:pBdr>
                 <w:bottom w:val="none" w:sz="0" w:space="0" w:color="000000"/>
@@ -5832,58 +5942,60 @@
           </w:tcPr>
           <w:p>
             <w:pPr>
-              <w:jc w:val="center"/>
-              <w:pBdr>
-                <w:bottom w:val="none" w:sz="0" w:space="0" w:color="000000"/>
-                <w:top w:val="none" w:sz="0" w:space="0" w:color="000000"/>
-                <w:left w:val="none" w:sz="0" w:space="0" w:color="000000"/>
-                <w:right w:val="none" w:sz="0" w:space="0" w:color="000000"/>
-              </w:pBdr>
-              <w:spacing w:after="100" w:before="100" w:line="240"/>
-              <w:ind w:left="100" w:right="100" w:firstLine="0" w:firstLineChars="0"/>
-              <w:rPr>
-                <w:rFonts w:ascii="Helvetica" w:hAnsi="Helvetica" w:eastAsia="Helvetica" w:cs="Helvetica"/>
-                <w:i w:val="false"/>
-                <w:b w:val="false"/>
-                <w:u w:val="none"/>
-                <w:sz w:val="20"/>
-                <w:szCs w:val="20"/>
-                <w:color w:val="000000"/>
-              </w:rPr>
-            </w:pPr>
-            <w:r>
-              <w:rPr>
-                <w:rFonts w:ascii="Helvetica" w:hAnsi="Helvetica" w:eastAsia="Helvetica" w:cs="Helvetica"/>
-                <w:i w:val="false"/>
-                <w:b w:val="false"/>
-                <w:u w:val="none"/>
-                <w:sz w:val="20"/>
-                <w:szCs w:val="20"/>
-                <w:color w:val="000000"/>
-              </w:rPr>
-              <w:t xml:space="preserve">21 [13.2–35]</w:t>
-            </w:r>
-          </w:p>
-        </w:tc>
-        <w:tc>
-          <w:tcPr>
-            <w:tcBorders>
-              <w:bottom w:val="none" w:sz="0" w:space="0" w:color="000000"/>
-              <w:top w:val="none" w:sz="0" w:space="0" w:color="000000"/>
-              <w:left w:val="none" w:sz="0" w:space="0" w:color="000000"/>
-              <w:right w:val="none" w:sz="0" w:space="0" w:color="000000"/>
-            </w:tcBorders>
-            <w:shd w:val="clear" w:color="auto" w:fill="FFFFFF"/>
-            <w:tcMar>
-              <w:top w:w="0" w:type="dxa"/>
-              <w:bottom w:w="0" w:type="dxa"/>
-              <w:left w:w="0" w:type="dxa"/>
-              <w:right w:w="0" w:type="dxa"/>
-            </w:tcMar>
-            <w:vAlign w:val="center"/>
-          </w:tcPr>
-          <w:p>
-            <w:pPr>
+              <w:pStyle w:val="Normal"/>
+              <w:jc w:val="center"/>
+              <w:pBdr>
+                <w:bottom w:val="none" w:sz="0" w:space="0" w:color="000000"/>
+                <w:top w:val="none" w:sz="0" w:space="0" w:color="000000"/>
+                <w:left w:val="none" w:sz="0" w:space="0" w:color="000000"/>
+                <w:right w:val="none" w:sz="0" w:space="0" w:color="000000"/>
+              </w:pBdr>
+              <w:spacing w:after="100" w:before="100" w:line="240"/>
+              <w:ind w:left="100" w:right="100" w:firstLine="0" w:firstLineChars="0"/>
+              <w:rPr>
+                <w:rFonts w:ascii="Helvetica" w:hAnsi="Helvetica" w:eastAsia="Helvetica" w:cs="Helvetica"/>
+                <w:i w:val="false"/>
+                <w:b w:val="false"/>
+                <w:u w:val="none"/>
+                <w:sz w:val="20"/>
+                <w:szCs w:val="20"/>
+                <w:color w:val="000000"/>
+              </w:rPr>
+            </w:pPr>
+            <w:r>
+              <w:rPr>
+                <w:rFonts w:ascii="Helvetica" w:hAnsi="Helvetica" w:eastAsia="Helvetica" w:cs="Helvetica"/>
+                <w:i w:val="false"/>
+                <w:b w:val="false"/>
+                <w:u w:val="none"/>
+                <w:sz w:val="20"/>
+                <w:szCs w:val="20"/>
+                <w:color w:val="000000"/>
+              </w:rPr>
+              <w:t xml:space="preserve">20.5 [13–31.5]</w:t>
+            </w:r>
+          </w:p>
+        </w:tc>
+        <w:tc>
+          <w:tcPr>
+            <w:tcBorders>
+              <w:bottom w:val="none" w:sz="0" w:space="0" w:color="000000"/>
+              <w:top w:val="none" w:sz="0" w:space="0" w:color="000000"/>
+              <w:left w:val="none" w:sz="0" w:space="0" w:color="000000"/>
+              <w:right w:val="none" w:sz="0" w:space="0" w:color="000000"/>
+            </w:tcBorders>
+            <w:shd w:val="clear" w:color="auto" w:fill="FFFFFF"/>
+            <w:tcMar>
+              <w:top w:w="0" w:type="dxa"/>
+              <w:bottom w:w="0" w:type="dxa"/>
+              <w:left w:w="0" w:type="dxa"/>
+              <w:right w:w="0" w:type="dxa"/>
+            </w:tcMar>
+            <w:vAlign w:val="center"/>
+          </w:tcPr>
+          <w:p>
+            <w:pPr>
+              <w:pStyle w:val="Normal"/>
               <w:jc w:val="center"/>
               <w:pBdr>
                 <w:bottom w:val="none" w:sz="0" w:space="0" w:color="000000"/>
@@ -5942,6 +6054,7 @@
           </w:tcPr>
           <w:p>
             <w:pPr>
+              <w:pStyle w:val="Normal"/>
               <w:jc w:val="left"/>
               <w:pBdr>
                 <w:bottom w:val="none" w:sz="0" w:space="0" w:color="000000"/>
@@ -5994,6 +6107,7 @@
           </w:tcPr>
           <w:p>
             <w:pPr>
+              <w:pStyle w:val="Normal"/>
               <w:jc w:val="center"/>
               <w:pBdr>
                 <w:bottom w:val="none" w:sz="0" w:space="0" w:color="000000"/>
@@ -6046,6 +6160,7 @@
           </w:tcPr>
           <w:p>
             <w:pPr>
+              <w:pStyle w:val="Normal"/>
               <w:jc w:val="center"/>
               <w:pBdr>
                 <w:bottom w:val="none" w:sz="0" w:space="0" w:color="000000"/>
@@ -6098,6 +6213,7 @@
           </w:tcPr>
           <w:p>
             <w:pPr>
+              <w:pStyle w:val="Normal"/>
               <w:jc w:val="center"/>
               <w:pBdr>
                 <w:bottom w:val="none" w:sz="0" w:space="0" w:color="000000"/>
@@ -6150,6 +6266,7 @@
           </w:tcPr>
           <w:p>
             <w:pPr>
+              <w:pStyle w:val="Normal"/>
               <w:jc w:val="center"/>
               <w:pBdr>
                 <w:bottom w:val="none" w:sz="0" w:space="0" w:color="000000"/>
@@ -6202,6 +6319,7 @@
           </w:tcPr>
           <w:p>
             <w:pPr>
+              <w:pStyle w:val="Normal"/>
               <w:jc w:val="center"/>
               <w:pBdr>
                 <w:bottom w:val="none" w:sz="0" w:space="0" w:color="000000"/>
@@ -6254,6 +6372,7 @@
           </w:tcPr>
           <w:p>
             <w:pPr>
+              <w:pStyle w:val="Normal"/>
               <w:jc w:val="center"/>
               <w:pBdr>
                 <w:bottom w:val="none" w:sz="0" w:space="0" w:color="000000"/>
@@ -6306,6 +6425,7 @@
           </w:tcPr>
           <w:p>
             <w:pPr>
+              <w:pStyle w:val="Normal"/>
               <w:jc w:val="center"/>
               <w:pBdr>
                 <w:bottom w:val="none" w:sz="0" w:space="0" w:color="000000"/>
@@ -6364,6 +6484,7 @@
           </w:tcPr>
           <w:p>
             <w:pPr>
+              <w:pStyle w:val="Normal"/>
               <w:jc w:val="left"/>
               <w:pBdr>
                 <w:bottom w:val="none" w:sz="0" w:space="0" w:color="000000"/>
@@ -6416,58 +6537,60 @@
           </w:tcPr>
           <w:p>
             <w:pPr>
-              <w:jc w:val="center"/>
-              <w:pBdr>
-                <w:bottom w:val="none" w:sz="0" w:space="0" w:color="000000"/>
-                <w:top w:val="none" w:sz="0" w:space="0" w:color="000000"/>
-                <w:left w:val="none" w:sz="0" w:space="0" w:color="000000"/>
-                <w:right w:val="none" w:sz="0" w:space="0" w:color="000000"/>
-              </w:pBdr>
-              <w:spacing w:after="100" w:before="100" w:line="240"/>
-              <w:ind w:left="100" w:right="100" w:firstLine="0" w:firstLineChars="0"/>
-              <w:rPr>
-                <w:rFonts w:ascii="Helvetica" w:hAnsi="Helvetica" w:eastAsia="Helvetica" w:cs="Helvetica"/>
-                <w:i w:val="false"/>
-                <w:b w:val="false"/>
-                <w:u w:val="none"/>
-                <w:sz w:val="20"/>
-                <w:szCs w:val="20"/>
-                <w:color w:val="000000"/>
-              </w:rPr>
-            </w:pPr>
-            <w:r>
-              <w:rPr>
-                <w:rFonts w:ascii="Helvetica" w:hAnsi="Helvetica" w:eastAsia="Helvetica" w:cs="Helvetica"/>
-                <w:i w:val="false"/>
-                <w:b w:val="false"/>
-                <w:u w:val="none"/>
-                <w:sz w:val="20"/>
-                <w:szCs w:val="20"/>
-                <w:color w:val="000000"/>
-              </w:rPr>
-              <w:t xml:space="preserve">4 [2–8.5]</w:t>
-            </w:r>
-          </w:p>
-        </w:tc>
-        <w:tc>
-          <w:tcPr>
-            <w:tcBorders>
-              <w:bottom w:val="none" w:sz="0" w:space="0" w:color="000000"/>
-              <w:top w:val="none" w:sz="0" w:space="0" w:color="000000"/>
-              <w:left w:val="none" w:sz="0" w:space="0" w:color="000000"/>
-              <w:right w:val="none" w:sz="0" w:space="0" w:color="000000"/>
-            </w:tcBorders>
-            <w:shd w:val="clear" w:color="auto" w:fill="FFFFFF"/>
-            <w:tcMar>
-              <w:top w:w="0" w:type="dxa"/>
-              <w:bottom w:w="0" w:type="dxa"/>
-              <w:left w:w="0" w:type="dxa"/>
-              <w:right w:w="0" w:type="dxa"/>
-            </w:tcMar>
-            <w:vAlign w:val="center"/>
-          </w:tcPr>
-          <w:p>
-            <w:pPr>
+              <w:pStyle w:val="Normal"/>
+              <w:jc w:val="center"/>
+              <w:pBdr>
+                <w:bottom w:val="none" w:sz="0" w:space="0" w:color="000000"/>
+                <w:top w:val="none" w:sz="0" w:space="0" w:color="000000"/>
+                <w:left w:val="none" w:sz="0" w:space="0" w:color="000000"/>
+                <w:right w:val="none" w:sz="0" w:space="0" w:color="000000"/>
+              </w:pBdr>
+              <w:spacing w:after="100" w:before="100" w:line="240"/>
+              <w:ind w:left="100" w:right="100" w:firstLine="0" w:firstLineChars="0"/>
+              <w:rPr>
+                <w:rFonts w:ascii="Helvetica" w:hAnsi="Helvetica" w:eastAsia="Helvetica" w:cs="Helvetica"/>
+                <w:i w:val="false"/>
+                <w:b w:val="false"/>
+                <w:u w:val="none"/>
+                <w:sz w:val="20"/>
+                <w:szCs w:val="20"/>
+                <w:color w:val="000000"/>
+              </w:rPr>
+            </w:pPr>
+            <w:r>
+              <w:rPr>
+                <w:rFonts w:ascii="Helvetica" w:hAnsi="Helvetica" w:eastAsia="Helvetica" w:cs="Helvetica"/>
+                <w:i w:val="false"/>
+                <w:b w:val="false"/>
+                <w:u w:val="none"/>
+                <w:sz w:val="20"/>
+                <w:szCs w:val="20"/>
+                <w:color w:val="000000"/>
+              </w:rPr>
+              <w:t xml:space="preserve">5 [2.2–9.2]</w:t>
+            </w:r>
+          </w:p>
+        </w:tc>
+        <w:tc>
+          <w:tcPr>
+            <w:tcBorders>
+              <w:bottom w:val="none" w:sz="0" w:space="0" w:color="000000"/>
+              <w:top w:val="none" w:sz="0" w:space="0" w:color="000000"/>
+              <w:left w:val="none" w:sz="0" w:space="0" w:color="000000"/>
+              <w:right w:val="none" w:sz="0" w:space="0" w:color="000000"/>
+            </w:tcBorders>
+            <w:shd w:val="clear" w:color="auto" w:fill="FFFFFF"/>
+            <w:tcMar>
+              <w:top w:w="0" w:type="dxa"/>
+              <w:bottom w:w="0" w:type="dxa"/>
+              <w:left w:w="0" w:type="dxa"/>
+              <w:right w:w="0" w:type="dxa"/>
+            </w:tcMar>
+            <w:vAlign w:val="center"/>
+          </w:tcPr>
+          <w:p>
+            <w:pPr>
+              <w:pStyle w:val="Normal"/>
               <w:jc w:val="center"/>
               <w:pBdr>
                 <w:bottom w:val="none" w:sz="0" w:space="0" w:color="000000"/>
@@ -6520,58 +6643,60 @@
           </w:tcPr>
           <w:p>
             <w:pPr>
-              <w:jc w:val="center"/>
-              <w:pBdr>
-                <w:bottom w:val="none" w:sz="0" w:space="0" w:color="000000"/>
-                <w:top w:val="none" w:sz="0" w:space="0" w:color="000000"/>
-                <w:left w:val="none" w:sz="0" w:space="0" w:color="000000"/>
-                <w:right w:val="none" w:sz="0" w:space="0" w:color="000000"/>
-              </w:pBdr>
-              <w:spacing w:after="100" w:before="100" w:line="240"/>
-              <w:ind w:left="100" w:right="100" w:firstLine="0" w:firstLineChars="0"/>
-              <w:rPr>
-                <w:rFonts w:ascii="Helvetica" w:hAnsi="Helvetica" w:eastAsia="Helvetica" w:cs="Helvetica"/>
-                <w:i w:val="false"/>
-                <w:b w:val="false"/>
-                <w:u w:val="none"/>
-                <w:sz w:val="20"/>
-                <w:szCs w:val="20"/>
-                <w:color w:val="000000"/>
-              </w:rPr>
-            </w:pPr>
-            <w:r>
-              <w:rPr>
-                <w:rFonts w:ascii="Helvetica" w:hAnsi="Helvetica" w:eastAsia="Helvetica" w:cs="Helvetica"/>
-                <w:i w:val="false"/>
-                <w:b w:val="false"/>
-                <w:u w:val="none"/>
-                <w:sz w:val="20"/>
-                <w:szCs w:val="20"/>
-                <w:color w:val="000000"/>
-              </w:rPr>
-              <w:t xml:space="preserve">0.68</w:t>
-            </w:r>
-          </w:p>
-        </w:tc>
-        <w:tc>
-          <w:tcPr>
-            <w:tcBorders>
-              <w:bottom w:val="none" w:sz="0" w:space="0" w:color="000000"/>
-              <w:top w:val="none" w:sz="0" w:space="0" w:color="000000"/>
-              <w:left w:val="none" w:sz="0" w:space="0" w:color="000000"/>
-              <w:right w:val="none" w:sz="0" w:space="0" w:color="000000"/>
-            </w:tcBorders>
-            <w:shd w:val="clear" w:color="auto" w:fill="FFFFFF"/>
-            <w:tcMar>
-              <w:top w:w="0" w:type="dxa"/>
-              <w:bottom w:w="0" w:type="dxa"/>
-              <w:left w:w="0" w:type="dxa"/>
-              <w:right w:w="0" w:type="dxa"/>
-            </w:tcMar>
-            <w:vAlign w:val="center"/>
-          </w:tcPr>
-          <w:p>
-            <w:pPr>
+              <w:pStyle w:val="Normal"/>
+              <w:jc w:val="center"/>
+              <w:pBdr>
+                <w:bottom w:val="none" w:sz="0" w:space="0" w:color="000000"/>
+                <w:top w:val="none" w:sz="0" w:space="0" w:color="000000"/>
+                <w:left w:val="none" w:sz="0" w:space="0" w:color="000000"/>
+                <w:right w:val="none" w:sz="0" w:space="0" w:color="000000"/>
+              </w:pBdr>
+              <w:spacing w:after="100" w:before="100" w:line="240"/>
+              <w:ind w:left="100" w:right="100" w:firstLine="0" w:firstLineChars="0"/>
+              <w:rPr>
+                <w:rFonts w:ascii="Helvetica" w:hAnsi="Helvetica" w:eastAsia="Helvetica" w:cs="Helvetica"/>
+                <w:i w:val="false"/>
+                <w:b w:val="false"/>
+                <w:u w:val="none"/>
+                <w:sz w:val="20"/>
+                <w:szCs w:val="20"/>
+                <w:color w:val="000000"/>
+              </w:rPr>
+            </w:pPr>
+            <w:r>
+              <w:rPr>
+                <w:rFonts w:ascii="Helvetica" w:hAnsi="Helvetica" w:eastAsia="Helvetica" w:cs="Helvetica"/>
+                <w:i w:val="false"/>
+                <w:b w:val="false"/>
+                <w:u w:val="none"/>
+                <w:sz w:val="20"/>
+                <w:szCs w:val="20"/>
+                <w:color w:val="000000"/>
+              </w:rPr>
+              <w:t xml:space="preserve">0.51</w:t>
+            </w:r>
+          </w:p>
+        </w:tc>
+        <w:tc>
+          <w:tcPr>
+            <w:tcBorders>
+              <w:bottom w:val="none" w:sz="0" w:space="0" w:color="000000"/>
+              <w:top w:val="none" w:sz="0" w:space="0" w:color="000000"/>
+              <w:left w:val="none" w:sz="0" w:space="0" w:color="000000"/>
+              <w:right w:val="none" w:sz="0" w:space="0" w:color="000000"/>
+            </w:tcBorders>
+            <w:shd w:val="clear" w:color="auto" w:fill="FFFFFF"/>
+            <w:tcMar>
+              <w:top w:w="0" w:type="dxa"/>
+              <w:bottom w:w="0" w:type="dxa"/>
+              <w:left w:w="0" w:type="dxa"/>
+              <w:right w:w="0" w:type="dxa"/>
+            </w:tcMar>
+            <w:vAlign w:val="center"/>
+          </w:tcPr>
+          <w:p>
+            <w:pPr>
+              <w:pStyle w:val="Normal"/>
               <w:jc w:val="center"/>
               <w:pBdr>
                 <w:bottom w:val="none" w:sz="0" w:space="0" w:color="000000"/>
@@ -6624,6 +6749,7 @@
           </w:tcPr>
           <w:p>
             <w:pPr>
+              <w:pStyle w:val="Normal"/>
               <w:jc w:val="center"/>
               <w:pBdr>
                 <w:bottom w:val="none" w:sz="0" w:space="0" w:color="000000"/>
@@ -6676,58 +6802,60 @@
           </w:tcPr>
           <w:p>
             <w:pPr>
-              <w:jc w:val="center"/>
-              <w:pBdr>
-                <w:bottom w:val="none" w:sz="0" w:space="0" w:color="000000"/>
-                <w:top w:val="none" w:sz="0" w:space="0" w:color="000000"/>
-                <w:left w:val="none" w:sz="0" w:space="0" w:color="000000"/>
-                <w:right w:val="none" w:sz="0" w:space="0" w:color="000000"/>
-              </w:pBdr>
-              <w:spacing w:after="100" w:before="100" w:line="240"/>
-              <w:ind w:left="100" w:right="100" w:firstLine="0" w:firstLineChars="0"/>
-              <w:rPr>
-                <w:rFonts w:ascii="Helvetica" w:hAnsi="Helvetica" w:eastAsia="Helvetica" w:cs="Helvetica"/>
-                <w:i w:val="false"/>
-                <w:b w:val="false"/>
-                <w:u w:val="none"/>
-                <w:sz w:val="20"/>
-                <w:szCs w:val="20"/>
-                <w:color w:val="000000"/>
-              </w:rPr>
-            </w:pPr>
-            <w:r>
-              <w:rPr>
-                <w:rFonts w:ascii="Helvetica" w:hAnsi="Helvetica" w:eastAsia="Helvetica" w:cs="Helvetica"/>
-                <w:i w:val="false"/>
-                <w:b w:val="false"/>
-                <w:u w:val="none"/>
-                <w:sz w:val="20"/>
-                <w:szCs w:val="20"/>
-                <w:color w:val="000000"/>
-              </w:rPr>
-              <w:t xml:space="preserve">3 [2–7]</w:t>
-            </w:r>
-          </w:p>
-        </w:tc>
-        <w:tc>
-          <w:tcPr>
-            <w:tcBorders>
-              <w:bottom w:val="none" w:sz="0" w:space="0" w:color="000000"/>
-              <w:top w:val="none" w:sz="0" w:space="0" w:color="000000"/>
-              <w:left w:val="none" w:sz="0" w:space="0" w:color="000000"/>
-              <w:right w:val="none" w:sz="0" w:space="0" w:color="000000"/>
-            </w:tcBorders>
-            <w:shd w:val="clear" w:color="auto" w:fill="FFFFFF"/>
-            <w:tcMar>
-              <w:top w:w="0" w:type="dxa"/>
-              <w:bottom w:w="0" w:type="dxa"/>
-              <w:left w:w="0" w:type="dxa"/>
-              <w:right w:w="0" w:type="dxa"/>
-            </w:tcMar>
-            <w:vAlign w:val="center"/>
-          </w:tcPr>
-          <w:p>
-            <w:pPr>
+              <w:pStyle w:val="Normal"/>
+              <w:jc w:val="center"/>
+              <w:pBdr>
+                <w:bottom w:val="none" w:sz="0" w:space="0" w:color="000000"/>
+                <w:top w:val="none" w:sz="0" w:space="0" w:color="000000"/>
+                <w:left w:val="none" w:sz="0" w:space="0" w:color="000000"/>
+                <w:right w:val="none" w:sz="0" w:space="0" w:color="000000"/>
+              </w:pBdr>
+              <w:spacing w:after="100" w:before="100" w:line="240"/>
+              <w:ind w:left="100" w:right="100" w:firstLine="0" w:firstLineChars="0"/>
+              <w:rPr>
+                <w:rFonts w:ascii="Helvetica" w:hAnsi="Helvetica" w:eastAsia="Helvetica" w:cs="Helvetica"/>
+                <w:i w:val="false"/>
+                <w:b w:val="false"/>
+                <w:u w:val="none"/>
+                <w:sz w:val="20"/>
+                <w:szCs w:val="20"/>
+                <w:color w:val="000000"/>
+              </w:rPr>
+            </w:pPr>
+            <w:r>
+              <w:rPr>
+                <w:rFonts w:ascii="Helvetica" w:hAnsi="Helvetica" w:eastAsia="Helvetica" w:cs="Helvetica"/>
+                <w:i w:val="false"/>
+                <w:b w:val="false"/>
+                <w:u w:val="none"/>
+                <w:sz w:val="20"/>
+                <w:szCs w:val="20"/>
+                <w:color w:val="000000"/>
+              </w:rPr>
+              <w:t xml:space="preserve">3.5 [2–7.2]</w:t>
+            </w:r>
+          </w:p>
+        </w:tc>
+        <w:tc>
+          <w:tcPr>
+            <w:tcBorders>
+              <w:bottom w:val="none" w:sz="0" w:space="0" w:color="000000"/>
+              <w:top w:val="none" w:sz="0" w:space="0" w:color="000000"/>
+              <w:left w:val="none" w:sz="0" w:space="0" w:color="000000"/>
+              <w:right w:val="none" w:sz="0" w:space="0" w:color="000000"/>
+            </w:tcBorders>
+            <w:shd w:val="clear" w:color="auto" w:fill="FFFFFF"/>
+            <w:tcMar>
+              <w:top w:w="0" w:type="dxa"/>
+              <w:bottom w:w="0" w:type="dxa"/>
+              <w:left w:w="0" w:type="dxa"/>
+              <w:right w:w="0" w:type="dxa"/>
+            </w:tcMar>
+            <w:vAlign w:val="center"/>
+          </w:tcPr>
+          <w:p>
+            <w:pPr>
+              <w:pStyle w:val="Normal"/>
               <w:jc w:val="center"/>
               <w:pBdr>
                 <w:bottom w:val="none" w:sz="0" w:space="0" w:color="000000"/>
@@ -6786,6 +6914,7 @@
           </w:tcPr>
           <w:p>
             <w:pPr>
+              <w:pStyle w:val="Normal"/>
               <w:jc w:val="left"/>
               <w:pBdr>
                 <w:bottom w:val="none" w:sz="0" w:space="0" w:color="000000"/>
@@ -6838,6 +6967,7 @@
           </w:tcPr>
           <w:p>
             <w:pPr>
+              <w:pStyle w:val="Normal"/>
               <w:jc w:val="center"/>
               <w:pBdr>
                 <w:bottom w:val="none" w:sz="0" w:space="0" w:color="000000"/>
@@ -6890,6 +7020,7 @@
           </w:tcPr>
           <w:p>
             <w:pPr>
+              <w:pStyle w:val="Normal"/>
               <w:jc w:val="center"/>
               <w:pBdr>
                 <w:bottom w:val="none" w:sz="0" w:space="0" w:color="000000"/>
@@ -6942,6 +7073,7 @@
           </w:tcPr>
           <w:p>
             <w:pPr>
+              <w:pStyle w:val="Normal"/>
               <w:jc w:val="center"/>
               <w:pBdr>
                 <w:bottom w:val="none" w:sz="0" w:space="0" w:color="000000"/>
@@ -6994,6 +7126,7 @@
           </w:tcPr>
           <w:p>
             <w:pPr>
+              <w:pStyle w:val="Normal"/>
               <w:jc w:val="center"/>
               <w:pBdr>
                 <w:bottom w:val="none" w:sz="0" w:space="0" w:color="000000"/>
@@ -7046,6 +7179,7 @@
           </w:tcPr>
           <w:p>
             <w:pPr>
+              <w:pStyle w:val="Normal"/>
               <w:jc w:val="center"/>
               <w:pBdr>
                 <w:bottom w:val="none" w:sz="0" w:space="0" w:color="000000"/>
@@ -7098,6 +7232,7 @@
           </w:tcPr>
           <w:p>
             <w:pPr>
+              <w:pStyle w:val="Normal"/>
               <w:jc w:val="center"/>
               <w:pBdr>
                 <w:bottom w:val="none" w:sz="0" w:space="0" w:color="000000"/>
@@ -7150,6 +7285,7 @@
           </w:tcPr>
           <w:p>
             <w:pPr>
+              <w:pStyle w:val="Normal"/>
               <w:jc w:val="center"/>
               <w:pBdr>
                 <w:bottom w:val="none" w:sz="0" w:space="0" w:color="000000"/>

</xml_diff>